<commit_message>
feat: implement English documentation rendering and improve table layout formatting in document generation scripts
</commit_message>
<xml_diff>
--- a/documentation/1_Documentacion_Tecnica.docx
+++ b/documentation/1_Documentacion_Tecnica.docx
@@ -37,7 +37,7 @@
         <w:br/>
         <w:t>Fuente técnica: oli_v6_deploy.py</w:t>
         <w:br/>
-        <w:t>Actualizado: 30 de abril de 2026</w:t>
+        <w:t>Actualizado: 11 de mayo de 2026</w:t>
       </w:r>
     </w:p>
     <w:p/>
@@ -80,6 +80,10 @@
         <w:gridCol w:w="3360"/>
       </w:tblGrid>
       <w:tr>
+        <w:trPr>
+          <w:cantSplit/>
+          <w:tblHeader w:val="true"/>
+        </w:trPr>
         <w:tc>
           <w:tcPr>
             <w:tcW w:type="dxa" w:w="1872"/>
@@ -142,6 +146,9 @@
         </w:tc>
       </w:tr>
       <w:tr>
+        <w:trPr>
+          <w:cantSplit/>
+        </w:trPr>
         <w:tc>
           <w:tcPr>
             <w:tcW w:type="dxa" w:w="1872"/>
@@ -198,6 +205,9 @@
         </w:tc>
       </w:tr>
       <w:tr>
+        <w:trPr>
+          <w:cantSplit/>
+        </w:trPr>
         <w:tc>
           <w:tcPr>
             <w:tcW w:type="dxa" w:w="1872"/>
@@ -254,6 +264,9 @@
         </w:tc>
       </w:tr>
       <w:tr>
+        <w:trPr>
+          <w:cantSplit/>
+        </w:trPr>
         <w:tc>
           <w:tcPr>
             <w:tcW w:type="dxa" w:w="1872"/>
@@ -310,6 +323,9 @@
         </w:tc>
       </w:tr>
       <w:tr>
+        <w:trPr>
+          <w:cantSplit/>
+        </w:trPr>
         <w:tc>
           <w:tcPr>
             <w:tcW w:type="dxa" w:w="1872"/>
@@ -360,12 +376,15 @@
               <w:rPr>
                 <w:b w:val="0"/>
               </w:rPr>
-              <w:t>Carga un índice de recomendaciones heredado y usa FAISS para RAG en documentos grandes; Tabs 5 y 6 clasifican con similitud coseno en numpy.</w:t>
+              <w:t>Carga un índice FAISS de recomendaciones al iniciar la app y usa FAISS para RAG en documentos grandes de Tab 4; Tabs 5 y 6 clasifican con similitud coseno en numpy, no con FAISS.</w:t>
             </w:r>
           </w:p>
         </w:tc>
       </w:tr>
       <w:tr>
+        <w:trPr>
+          <w:cantSplit/>
+        </w:trPr>
         <w:tc>
           <w:tcPr>
             <w:tcW w:type="dxa" w:w="1872"/>
@@ -422,6 +441,9 @@
         </w:tc>
       </w:tr>
       <w:tr>
+        <w:trPr>
+          <w:cantSplit/>
+        </w:trPr>
         <w:tc>
           <w:tcPr>
             <w:tcW w:type="dxa" w:w="1872"/>
@@ -500,6 +522,10 @@
         <w:gridCol w:w="3360"/>
       </w:tblGrid>
       <w:tr>
+        <w:trPr>
+          <w:cantSplit/>
+          <w:tblHeader w:val="true"/>
+        </w:trPr>
         <w:tc>
           <w:tcPr>
             <w:tcW w:type="dxa" w:w="1008"/>
@@ -562,6 +588,9 @@
         </w:tc>
       </w:tr>
       <w:tr>
+        <w:trPr>
+          <w:cantSplit/>
+        </w:trPr>
         <w:tc>
           <w:tcPr>
             <w:tcW w:type="dxa" w:w="1008"/>
@@ -618,6 +647,9 @@
         </w:tc>
       </w:tr>
       <w:tr>
+        <w:trPr>
+          <w:cantSplit/>
+        </w:trPr>
         <w:tc>
           <w:tcPr>
             <w:tcW w:type="dxa" w:w="1008"/>
@@ -674,6 +706,9 @@
         </w:tc>
       </w:tr>
       <w:tr>
+        <w:trPr>
+          <w:cantSplit/>
+        </w:trPr>
         <w:tc>
           <w:tcPr>
             <w:tcW w:type="dxa" w:w="1008"/>
@@ -730,6 +765,9 @@
         </w:tc>
       </w:tr>
       <w:tr>
+        <w:trPr>
+          <w:cantSplit/>
+        </w:trPr>
         <w:tc>
           <w:tcPr>
             <w:tcW w:type="dxa" w:w="1008"/>
@@ -786,6 +824,9 @@
         </w:tc>
       </w:tr>
       <w:tr>
+        <w:trPr>
+          <w:cantSplit/>
+        </w:trPr>
         <w:tc>
           <w:tcPr>
             <w:tcW w:type="dxa" w:w="1008"/>
@@ -836,12 +877,15 @@
               <w:rPr>
                 <w:b w:val="0"/>
               </w:rPr>
-              <w:t>Clasifica recomendaciones en español contra Frame_Recommendations_English.xlsx, con filtros, treemaps, evolución temporal, análisis profundo y resumen.</w:t>
+              <w:t>Clasifica recomendaciones desde una interfaz en español contra Frame_Recommendations_English.xlsx; el campo requerido del archivo de recomendaciones es Recommendation description.</w:t>
             </w:r>
           </w:p>
         </w:tc>
       </w:tr>
       <w:tr>
+        <w:trPr>
+          <w:cantSplit/>
+        </w:trPr>
         <w:tc>
           <w:tcPr>
             <w:tcW w:type="dxa" w:w="1008"/>
@@ -1133,7 +1177,7 @@
         <w:pStyle w:val="ListBullet"/>
       </w:pPr>
       <w:r>
-        <w:t>Análisis profundo de recomendaciones: selector entre gpt-4o-mini y gpt-4o; la función de análisis de pares usa gpt-4o-mini por defecto.</w:t>
+        <w:t>Análisis profundo de recomendaciones: la UI muestra un selector entre gpt-4o-mini y gpt-4o, pero el código actual no pasa esa selección a run_row_analysis; analyze_recommendation_plan_pair usa gpt-4o-mini por defecto.</w:t>
       </w:r>
     </w:p>
     <w:p>
@@ -1149,7 +1193,7 @@
         <w:pStyle w:val="ListBullet"/>
       </w:pPr>
       <w:r>
-        <w:t>En el chat documental, textos de hasta 100,000 caracteres usan contexto completo; textos mayores generan fragmentos de 2,000 caracteres con solape de 300 y RAG con FAISS.</w:t>
+        <w:t>En el chat documental, textos totales de hasta 100,000 caracteres usan contexto completo, luego se recortan a 110,000 tokens; textos mayores generan fragmentos de 2,000 caracteres con solape de 300 y RAG con FAISS.</w:t>
       </w:r>
     </w:p>
     <w:p>
@@ -1157,12 +1201,57 @@
         <w:pStyle w:val="Heading2"/>
       </w:pPr>
       <w:r>
-        <w:t>5.1 Regla de temas transversales en Tab 1</w:t>
+        <w:t>5.1 Regla de preguntas en dos partes en Tab 1</w:t>
       </w:r>
     </w:p>
     <w:p>
       <w:r>
-        <w:t>Tab 1 mantiene el marco A-E general para preguntas con sujeto específico, pero aplica una regla reducida cuando la pregunta corresponde a un tema transversal configurado.</w:t>
+        <w:t>Tab 1 detecta preguntas compuestas mediante parse_two_part_question, con patrones para una declaración seguida de pregunta, separadores explícitos como 'específicamente', dos signos de pregunta, y casos unidos sin espacio. Cuando se detectan dos partes, la Parte 2 es el foco evaluativo y la Parte 1 es solo marco contextual.</w:t>
+      </w:r>
+    </w:p>
+    <w:p>
+      <w:pPr>
+        <w:pStyle w:val="ListBullet"/>
+      </w:pPr>
+      <w:r>
+        <w:t>El razonamiento del primer análisis debe iniciar con 'Se identificaron 2 partes en esta pregunta.'.</w:t>
+      </w:r>
+    </w:p>
+    <w:p>
+      <w:pPr>
+        <w:pStyle w:val="ListBullet"/>
+      </w:pPr>
+      <w:r>
+        <w:t>La evidencia se etiqueta como [DEDICATED] cuando aporta elementos específicos al sujeto evaluado y como [FRAMING] cuando es solo contexto, lista de grupos o lenguaje general.</w:t>
+      </w:r>
+    </w:p>
+    <w:p>
+      <w:pPr>
+        <w:pStyle w:val="ListBullet"/>
+      </w:pPr>
+      <w:r>
+        <w:t>El crítico de Tab 1 vuelve a evaluar con el documento completo y el código aplica una compuerta mecánica sobre el veredicto.</w:t>
+      </w:r>
+    </w:p>
+    <w:p>
+      <w:pPr>
+        <w:pStyle w:val="ListBullet"/>
+      </w:pPr>
+      <w:r>
+        <w:t>Si el modelo no mantiene el foco en Parte 2, la fila puede quedar con Status = Partial aunque el análisis haya terminado.</w:t>
+      </w:r>
+    </w:p>
+    <w:p>
+      <w:pPr>
+        <w:pStyle w:val="Heading2"/>
+      </w:pPr>
+      <w:r>
+        <w:t>5.2 Regla de temas transversales en Tab 1</w:t>
+      </w:r>
+    </w:p>
+    <w:p>
+      <w:r>
+        <w:t>Tab 1 mantiene el marco A-E general para preguntas con sujeto específico, pero lo omite por completo cuando la pregunta corresponde a un tema transversal configurado.</w:t>
       </w:r>
     </w:p>
     <w:tbl>
@@ -1177,6 +1266,10 @@
         <w:gridCol w:w="5040"/>
       </w:tblGrid>
       <w:tr>
+        <w:trPr>
+          <w:cantSplit/>
+          <w:tblHeader w:val="true"/>
+        </w:trPr>
         <w:tc>
           <w:tcPr>
             <w:tcW w:type="dxa" w:w="3024"/>
@@ -1219,6 +1312,9 @@
         </w:tc>
       </w:tr>
       <w:tr>
+        <w:trPr>
+          <w:cantSplit/>
+        </w:trPr>
         <w:tc>
           <w:tcPr>
             <w:tcW w:type="dxa" w:w="3024"/>
@@ -1257,6 +1353,9 @@
         </w:tc>
       </w:tr>
       <w:tr>
+        <w:trPr>
+          <w:cantSplit/>
+        </w:trPr>
         <w:tc>
           <w:tcPr>
             <w:tcW w:type="dxa" w:w="3024"/>
@@ -1295,6 +1394,9 @@
         </w:tc>
       </w:tr>
       <w:tr>
+        <w:trPr>
+          <w:cantSplit/>
+        </w:trPr>
         <w:tc>
           <w:tcPr>
             <w:tcW w:type="dxa" w:w="3024"/>
@@ -1333,6 +1435,9 @@
         </w:tc>
       </w:tr>
       <w:tr>
+        <w:trPr>
+          <w:cantSplit/>
+        </w:trPr>
         <w:tc>
           <w:tcPr>
             <w:tcW w:type="dxa" w:w="3024"/>
@@ -1371,6 +1476,9 @@
         </w:tc>
       </w:tr>
       <w:tr>
+        <w:trPr>
+          <w:cantSplit/>
+        </w:trPr>
         <w:tc>
           <w:tcPr>
             <w:tcW w:type="dxa" w:w="3024"/>
@@ -1422,6 +1530,10 @@
         <w:gridCol w:w="5040"/>
       </w:tblGrid>
       <w:tr>
+        <w:trPr>
+          <w:cantSplit/>
+          <w:tblHeader w:val="true"/>
+        </w:trPr>
         <w:tc>
           <w:tcPr>
             <w:tcW w:type="dxa" w:w="1872"/>
@@ -1464,6 +1576,9 @@
         </w:tc>
       </w:tr>
       <w:tr>
+        <w:trPr>
+          <w:cantSplit/>
+        </w:trPr>
         <w:tc>
           <w:tcPr>
             <w:tcW w:type="dxa" w:w="1872"/>
@@ -1502,6 +1617,9 @@
         </w:tc>
       </w:tr>
       <w:tr>
+        <w:trPr>
+          <w:cantSplit/>
+        </w:trPr>
         <w:tc>
           <w:tcPr>
             <w:tcW w:type="dxa" w:w="1872"/>
@@ -1543,7 +1661,63 @@
     <w:p/>
     <w:p>
       <w:r>
-        <w:t>La calificación automática para estos temas es: Yes cuando A y B están presentes; Partial cuando solo A o solo B está presente; No cuando no están presentes ni A ni B.</w:t>
+        <w:t>La calificación automática para estos temas es: Yes cuando A y B están presentes; Partial cuando solo A o solo B está presente; No cuando no están presentes ni A ni B. Indicadores y metas no cuentan para la regla transversal. El crítico puede sobrescribir mecánicamente un veredicto inconsistente con A/B.</w:t>
+      </w:r>
+    </w:p>
+    <w:p>
+      <w:pPr>
+        <w:pStyle w:val="Heading2"/>
+      </w:pPr>
+      <w:r>
+        <w:t>5.3 Comportamiento preciso de Tab 4</w:t>
+      </w:r>
+    </w:p>
+    <w:p>
+      <w:pPr>
+        <w:pStyle w:val="ListBullet"/>
+      </w:pPr>
+      <w:r>
+        <w:t>DOCX se extrae con python-docx leyendo párrafos; TXT se lee como texto plano UTF-8 con errors='ignore'. Este flujo no usa el extractor jerárquico enriquecido, por lo que tablas, metadatos de encabezado, páginas y citas por sección no son confiables en Tab 4.</w:t>
+      </w:r>
+    </w:p>
+    <w:p>
+      <w:pPr>
+        <w:pStyle w:val="ListBullet"/>
+      </w:pPr>
+      <w:r>
+        <w:t>Para documentos grandes, los embeddings de fragmentos se guardan en st.session_state; en cada pregunta se reconstruye un FAISS IndexFlatIP, se normalizan los vectores y se recuperan hasta 15 fragmentos vectoriales.</w:t>
+      </w:r>
+    </w:p>
+    <w:p>
+      <w:pPr>
+        <w:pStyle w:val="ListBullet"/>
+      </w:pPr>
+      <w:r>
+        <w:t>El contexto RAG agrega además hasta 5 fragmentos por coincidencia exacta de palabras clave, deduplicados contra los fragmentos vectoriales.</w:t>
+      </w:r>
+    </w:p>
+    <w:p>
+      <w:pPr>
+        <w:pStyle w:val="ListBullet"/>
+      </w:pPr>
+      <w:r>
+        <w:t>La llamada al modelo incluye solo los últimos 5 mensajes del chat.</w:t>
+      </w:r>
+    </w:p>
+    <w:p>
+      <w:pPr>
+        <w:pStyle w:val="ListBullet"/>
+      </w:pPr>
+      <w:r>
+        <w:t>La detección de cambio de archivos usa la lista de nombres, no hash de contenido; si se sube otro archivo con el mismo nombre puede quedar estado anterior hasta reiniciar sesión o cambiar nombres.</w:t>
+      </w:r>
+    </w:p>
+    <w:p>
+      <w:pPr>
+        <w:pStyle w:val="ListBullet"/>
+      </w:pPr>
+      <w:r>
+        <w:t>La ruta de documentos pequeños exige responder solo con el documento; la ruta RAG permite inferencia con pistas contextuales, por lo que las conclusiones deben verificarse contra el archivo fuente.</w:t>
       </w:r>
     </w:p>
     <w:p>
@@ -1575,7 +1749,7 @@
         <w:pStyle w:val="ListBullet"/>
       </w:pPr>
       <w:r>
-        <w:t>load_embeddings() carga emb_Recomm_rec_cl_4.pt y Recommendation_RAG_Metadata.pt y construye un índice FAISS en memoria; en el código actual ese índice pertenece al flujo de búsqueda de recomendaciones que quedó comentado, no a las pestañas activas de clasificación.</w:t>
+        <w:t>load_embeddings() carga emb_Recomm_rec_cl_4.pt y Recommendation_RAG_Metadata.pt y construye un índice FAISS en memoria. Aunque la interfaz visible de búsqueda de recomendaciones está comentada, esta carga sigue siendo una dependencia activa porque se ejecuta durante el arranque.</w:t>
       </w:r>
     </w:p>
     <w:p>
@@ -1592,6 +1766,22 @@
       </w:pPr>
       <w:r>
         <w:t>El bloque principal inicializa datos y embeddings dos veces en el archivo; el comportamiento final es equivalente, pero una futura limpieza puede consolidarlo.</w:t>
+      </w:r>
+    </w:p>
+    <w:p>
+      <w:pPr>
+        <w:pStyle w:val="ListBullet"/>
+      </w:pPr>
+      <w:r>
+        <w:t>Tabs 5 y 6 usan embeddings_cache.pkl para cachear embeddings de clasificación y analysis_cache.pkl para análisis profundo de recomendaciones.</w:t>
+      </w:r>
+    </w:p>
+    <w:p>
+      <w:pPr>
+        <w:pStyle w:val="ListBullet"/>
+      </w:pPr>
+      <w:r>
+        <w:t>Tab 4 guarda documentos, fragmentos y embeddings solo en st.session_state durante la sesión.</w:t>
       </w:r>
     </w:p>
     <w:p>
@@ -1636,6 +1826,10 @@
         <w:gridCol w:w="5040"/>
       </w:tblGrid>
       <w:tr>
+        <w:trPr>
+          <w:cantSplit/>
+          <w:tblHeader w:val="true"/>
+        </w:trPr>
         <w:tc>
           <w:tcPr>
             <w:tcW w:type="dxa" w:w="3024"/>
@@ -1678,6 +1872,9 @@
         </w:tc>
       </w:tr>
       <w:tr>
+        <w:trPr>
+          <w:cantSplit/>
+        </w:trPr>
         <w:tc>
           <w:tcPr>
             <w:tcW w:type="dxa" w:w="3024"/>
@@ -1716,6 +1913,9 @@
         </w:tc>
       </w:tr>
       <w:tr>
+        <w:trPr>
+          <w:cantSplit/>
+        </w:trPr>
         <w:tc>
           <w:tcPr>
             <w:tcW w:type="dxa" w:w="3024"/>
@@ -1754,6 +1954,9 @@
         </w:tc>
       </w:tr>
       <w:tr>
+        <w:trPr>
+          <w:cantSplit/>
+        </w:trPr>
         <w:tc>
           <w:tcPr>
             <w:tcW w:type="dxa" w:w="3024"/>
@@ -1792,6 +1995,9 @@
         </w:tc>
       </w:tr>
       <w:tr>
+        <w:trPr>
+          <w:cantSplit/>
+        </w:trPr>
         <w:tc>
           <w:tcPr>
             <w:tcW w:type="dxa" w:w="3024"/>
@@ -1830,6 +2036,9 @@
         </w:tc>
       </w:tr>
       <w:tr>
+        <w:trPr>
+          <w:cantSplit/>
+        </w:trPr>
         <w:tc>
           <w:tcPr>
             <w:tcW w:type="dxa" w:w="3024"/>
@@ -1868,6 +2077,9 @@
         </w:tc>
       </w:tr>
       <w:tr>
+        <w:trPr>
+          <w:cantSplit/>
+        </w:trPr>
         <w:tc>
           <w:tcPr>
             <w:tcW w:type="dxa" w:w="3024"/>
@@ -1906,6 +2118,9 @@
         </w:tc>
       </w:tr>
       <w:tr>
+        <w:trPr>
+          <w:cantSplit/>
+        </w:trPr>
         <w:tc>
           <w:tcPr>
             <w:tcW w:type="dxa" w:w="3024"/>
@@ -1938,12 +2153,15 @@
               <w:rPr>
                 <w:b w:val="0"/>
               </w:rPr>
-              <w:t>Ruta de emb_LL_ll_cl_4.pt para lecciones aprendidas.</w:t>
+              <w:t>Ruta de emb_LL_ll_cl_4.pt para una función de lecciones que no está conectada a una pestaña activa.</w:t>
             </w:r>
           </w:p>
         </w:tc>
       </w:tr>
       <w:tr>
+        <w:trPr>
+          <w:cantSplit/>
+        </w:trPr>
         <w:tc>
           <w:tcPr>
             <w:tcW w:type="dxa" w:w="3024"/>
@@ -1976,7 +2194,7 @@
               <w:rPr>
                 <w:b w:val="0"/>
               </w:rPr>
-              <w:t>Ruta de lessons_metadata.pt para lecciones aprendidas.</w:t>
+              <w:t>Ruta de lessons_metadata.pt para una función de lecciones que no está conectada a una pestaña activa.</w:t>
             </w:r>
           </w:p>
         </w:tc>
@@ -1996,7 +2214,7 @@
         <w:pStyle w:val="ListBullet"/>
       </w:pPr>
       <w:r>
-        <w:t>La app no implementa autenticación, autorización ni auditoría propia; depende del control del entorno de hosting.</w:t>
+        <w:t>La app no implementa autenticación, autorización, auditoría, aislamiento por tenant, escaneo de archivos cargados ni redacción automática de secretos; depende del control del entorno de hosting.</w:t>
       </w:r>
     </w:p>
     <w:p>
@@ -2029,6 +2247,14 @@
       </w:pPr>
       <w:r>
         <w:t>Los archivos de salida XLSX/ZIP pueden contener citas textuales del documento original y deben manejarse con la misma confidencialidad.</w:t>
+      </w:r>
+    </w:p>
+    <w:p>
+      <w:pPr>
+        <w:pStyle w:val="ListBullet"/>
+      </w:pPr>
+      <w:r>
+        <w:t>Los cachés pickle locales no están cifrados ni verificados por integridad.</w:t>
       </w:r>
     </w:p>
     <w:sectPr>

</xml_diff>